<commit_message>
test(corpus): rule documents that show what the review asked: tall headers crossing a page, mode 14 settings, typed VML pictures
</commit_message>
<xml_diff>
--- a/tests/corpus/word-rules/E-table-autofit-14.docx
+++ b/tests/corpus/word-rules/E-table-autofit-14.docx
@@ -1,6 +1,6 @@
 
 <file path=word/document.xml><?xml version="1.0" encoding="utf-8"?>
-<w:document xmlns:w="http://schemas.openxmlformats.org/wordprocessingml/2006/main" xmlns:r="http://schemas.openxmlformats.org/officeDocument/2006/relationships">
+<w:document xmlns:w="http://schemas.openxmlformats.org/wordprocessingml/2006/main" xmlns:r="http://schemas.openxmlformats.org/officeDocument/2006/relationships" xmlns:v="urn:schemas-microsoft-com:vml" xmlns:o="urn:schemas-microsoft-com:office:office" xmlns:w10="urn:schemas-microsoft-com:office:word">
   <w:body>
     <w:p>
       <w:r>
@@ -360,6 +360,190 @@
         <w:tc>
           <w:tcPr>
             <w:tcW w:w="2000" w:type="pct"/>
+          </w:tcPr>
+          <w:p>
+            <w:r>
+              <w:t xml:space="preserve">Middle text r2</w:t>
+            </w:r>
+          </w:p>
+        </w:tc>
+      </w:tr>
+    </w:tbl>
+    <w:p/>
+    <w:p>
+      <w:r>
+        <w:t xml:space="preserve">Case 11: three cells each holding Interdepartmentalisationsprocedurecharacteristically, together wider than the text width</w:t>
+      </w:r>
+    </w:p>
+    <w:tbl>
+      <w:tblPr>
+        <w:tblW w:w="0" w:type="auto"/>
+        <w:tblBorders>
+          <w:top w:val="single" w:sz="4" w:space="0" w:color="000000"/>
+          <w:left w:val="single" w:sz="4" w:space="0" w:color="000000"/>
+          <w:bottom w:val="single" w:sz="4" w:space="0" w:color="000000"/>
+          <w:right w:val="single" w:sz="4" w:space="0" w:color="000000"/>
+          <w:insideH w:val="single" w:sz="4" w:space="0" w:color="000000"/>
+          <w:insideV w:val="single" w:sz="4" w:space="0" w:color="000000"/>
+        </w:tblBorders>
+        <w:tblCellMar>
+          <w:left w:w="108" w:type="dxa"/>
+          <w:right w:w="108" w:type="dxa"/>
+        </w:tblCellMar>
+      </w:tblPr>
+      <w:tblGrid>
+        <w:gridCol w:w="3008"/>
+        <w:gridCol w:w="3008"/>
+        <w:gridCol w:w="3008"/>
+      </w:tblGrid>
+      <w:tr>
+        <w:tc>
+          <w:tcPr>
+            <w:tcW w:w="0" w:type="auto"/>
+          </w:tcPr>
+          <w:p>
+            <w:r>
+              <w:t xml:space="preserve">Interdepartmentalisationsprocedurecharacteristically</w:t>
+            </w:r>
+          </w:p>
+        </w:tc>
+        <w:tc>
+          <w:tcPr>
+            <w:tcW w:w="0" w:type="auto"/>
+          </w:tcPr>
+          <w:p>
+            <w:r>
+              <w:t xml:space="preserve">Interdepartmentalisationsprocedurecharacteristically</w:t>
+            </w:r>
+          </w:p>
+        </w:tc>
+        <w:tc>
+          <w:tcPr>
+            <w:tcW w:w="0" w:type="auto"/>
+          </w:tcPr>
+          <w:p>
+            <w:r>
+              <w:t xml:space="preserve">Interdepartmentalisationsprocedurecharacteristically</w:t>
+            </w:r>
+          </w:p>
+        </w:tc>
+      </w:tr>
+    </w:tbl>
+    <w:p/>
+    <w:p>
+      <w:r>
+        <w:t xml:space="preserve">Case 12: a floating picture of 144 x 72 pt at the left margin, square wrap, then an autofit table (cells auto) beside it</w:t>
+      </w:r>
+    </w:p>
+    <w:p>
+      <w:r>
+        <w:pict>
+          <v:shapetype id="_x0000_t75" coordsize="21600,21600" o:spt="75" o:preferrelative="t" path="m@4@5l@4@11@9@11@9@5xe" filled="f" stroked="f">
+            <v:stroke joinstyle="miter"/>
+            <v:formulas>
+              <v:f eqn="if lineDrawn pixelLineWidth 0"/>
+              <v:f eqn="sum @0 1 0"/>
+              <v:f eqn="sum 0 0 @1"/>
+              <v:f eqn="prod @2 1 2"/>
+              <v:f eqn="prod @3 21600 pixelWidth"/>
+              <v:f eqn="prod @3 21600 pixelHeight"/>
+              <v:f eqn="sum @0 0 1"/>
+              <v:f eqn="prod @6 1 2"/>
+              <v:f eqn="prod @7 21600 pixelWidth"/>
+              <v:f eqn="sum @8 21600 0"/>
+              <v:f eqn="prod @7 21600 pixelHeight"/>
+              <v:f eqn="sum @10 21600 0"/>
+            </v:formulas>
+            <v:path o:extrusionok="f" gradientshapeok="t" o:connecttype="rect"/>
+            <o:lock v:ext="edit" aspectratio="t"/>
+          </v:shapetype>
+          <v:shape id="f1" type="#_x0000_t75" style="position:absolute;margin-left:0;margin-top:0;width:144pt;height:72pt;z-index:1;mso-position-horizontal-relative:margin;mso-position-vertical-relative:paragraph">
+            <v:imagedata r:id="rIdimage1" o:title=""/>
+            <w10:wrap type="square"/>
+          </v:shape>
+        </w:pict>
+      </w:r>
+      <w:r>
+        <w:t xml:space="preserve">The picture is anchored here.</w:t>
+      </w:r>
+    </w:p>
+    <w:tbl>
+      <w:tblPr>
+        <w:tblW w:w="0" w:type="auto"/>
+        <w:tblBorders>
+          <w:top w:val="single" w:sz="4" w:space="0" w:color="000000"/>
+          <w:left w:val="single" w:sz="4" w:space="0" w:color="000000"/>
+          <w:bottom w:val="single" w:sz="4" w:space="0" w:color="000000"/>
+          <w:right w:val="single" w:sz="4" w:space="0" w:color="000000"/>
+          <w:insideH w:val="single" w:sz="4" w:space="0" w:color="000000"/>
+          <w:insideV w:val="single" w:sz="4" w:space="0" w:color="000000"/>
+        </w:tblBorders>
+        <w:tblCellMar>
+          <w:left w:w="108" w:type="dxa"/>
+          <w:right w:w="108" w:type="dxa"/>
+        </w:tblCellMar>
+      </w:tblPr>
+      <w:tblGrid>
+        <w:gridCol w:w="3008"/>
+        <w:gridCol w:w="3008"/>
+        <w:gridCol w:w="3008"/>
+      </w:tblGrid>
+      <w:tr>
+        <w:tc>
+          <w:tcPr>
+            <w:tcW w:w="0" w:type="auto"/>
+          </w:tcPr>
+          <w:p>
+            <w:r>
+              <w:t xml:space="preserve">Ab r1</w:t>
+            </w:r>
+          </w:p>
+        </w:tc>
+        <w:tc>
+          <w:tcPr>
+            <w:tcW w:w="0" w:type="auto"/>
+          </w:tcPr>
+          <w:p>
+            <w:r>
+              <w:t xml:space="preserve">A longer cell of several words r1</w:t>
+            </w:r>
+          </w:p>
+        </w:tc>
+        <w:tc>
+          <w:tcPr>
+            <w:tcW w:w="0" w:type="auto"/>
+          </w:tcPr>
+          <w:p>
+            <w:r>
+              <w:t xml:space="preserve">Middle text r1</w:t>
+            </w:r>
+          </w:p>
+        </w:tc>
+      </w:tr>
+      <w:tr>
+        <w:tc>
+          <w:tcPr>
+            <w:tcW w:w="0" w:type="auto"/>
+          </w:tcPr>
+          <w:p>
+            <w:r>
+              <w:t xml:space="preserve">Ab r2</w:t>
+            </w:r>
+          </w:p>
+        </w:tc>
+        <w:tc>
+          <w:tcPr>
+            <w:tcW w:w="0" w:type="auto"/>
+          </w:tcPr>
+          <w:p>
+            <w:r>
+              <w:t xml:space="preserve">A longer cell of several words r2</w:t>
+            </w:r>
+          </w:p>
+        </w:tc>
+        <w:tc>
+          <w:tcPr>
+            <w:tcW w:w="0" w:type="auto"/>
           </w:tcPr>
           <w:p>
             <w:r>

</xml_diff>

<commit_message>
test(corpus): a picture wide enough that the autofit table must narrow beside it, and checks of the pictures' bytes
</commit_message>
<xml_diff>
--- a/tests/corpus/word-rules/E-table-autofit-14.docx
+++ b/tests/corpus/word-rules/E-table-autofit-14.docx
@@ -432,7 +432,7 @@
     <w:p/>
     <w:p>
       <w:r>
-        <w:t xml:space="preserve">Case 12: a floating picture of 144 x 72 pt at the left margin, square wrap, then an autofit table (cells auto) beside it</w:t>
+        <w:t xml:space="preserve">Case 12: a floating picture of 216 x 108 pt at the left margin, square wrap, then an autofit table (cells auto) beside it, whose content is wider than the room beside the picture</w:t>
       </w:r>
     </w:p>
     <w:p>
@@ -457,7 +457,7 @@
             <v:path o:extrusionok="f" gradientshapeok="t" o:connecttype="rect"/>
             <o:lock v:ext="edit" aspectratio="t"/>
           </v:shapetype>
-          <v:shape id="f1" type="#_x0000_t75" style="position:absolute;margin-left:0;margin-top:0;width:144pt;height:72pt;z-index:1;mso-position-horizontal-relative:margin;mso-position-vertical-relative:paragraph">
+          <v:shape id="f1" type="#_x0000_t75" style="position:absolute;margin-left:0;margin-top:0;width:216pt;height:108pt;z-index:1;mso-position-horizontal-relative:margin;mso-position-vertical-relative:paragraph">
             <v:imagedata r:id="rIdimage1" o:title=""/>
             <w10:wrap type="square"/>
           </v:shape>

</xml_diff>